<commit_message>
Plain-language How it works page + em-dash sweep everywhere
The methodology tab is now a conversation in basketball vocabulary
(what is this, why trust it, what it sees and cannot see, what notes
and the war room do); the technical memo stays in the repo and docx
for technical readers. Style rule applied across all user-facing
writing: zero em-dashes in app copy, memo, README, seed notes, and
the regenerated Word document; seed note extractions re-run to match.

Co-Authored-By: Claude Fable 5 <noreply@anthropic.com>
</commit_message>
<xml_diff>
--- a/report/The-Second-Round-memo.docx
+++ b/report/The-Second-Round-memo.docx
@@ -114,7 +114,7 @@
         <w:spacing w:after="160"/>
       </w:pPr>
       <w:r>
-        <w:t xml:space="preserve">We built a fair-value model that prices every college prospect using only pre-draft information — no draft slots, no mock drafts, no consensus boards — and compared its prices to where players actually went. Out of sample, across the 2009–2021 classes, </w:t>
+        <w:t xml:space="preserve">We built a fair-value model that prices every college prospect using only pre-draft information, and compared its prices to where players actually went. It never sees draft slots, mock drafts, or consensus boards. Out of sample, across the 2009 to 2021 classes, </w:t>
       </w:r>
       <w:r>
         <w:rPr>
@@ -134,7 +134,7 @@
         <w:t xml:space="preserve">at the extremes of disagreement, the model is significantly right.</w:t>
       </w:r>
       <w:r>
-        <w:t xml:space="preserve"> Its loudest 40 historical favorites returned +5.3 utility points above their draft-slot price (permutation p &lt; 0.0002); its loudest 40 fades returned −2.1 below (p &lt; 0.0002). The recommendation is not “re-rank the board.” It is: when this model disagrees loudly with the room, schedule the extra film session.</w:t>
+        <w:t xml:space="preserve"> Its loudest 40 historical favorites returned +5.3 utility points above their draft-slot price (permutation p &lt; 0.0002); its loudest 40 fades returned 2.1 points below (p &lt; 0.0002). The recommendation is not to re-rank the board. It is this: when the model disagrees loudly with the room, schedule the extra film session.</w:t>
       </w:r>
     </w:p>
     <w:p>
@@ -157,7 +157,7 @@
         <w:t xml:space="preserve">The model wanted more. </w:t>
       </w:r>
       <w:r>
-        <w:t xml:space="preserve">Cam Boozer (pick 3) is the loudest call in the class: 93% [81–99%] probability of at least All-Star-level production in his first four seasons, driven by historic offensive production at age 18.9. His statistical family — Zion, Blake Griffin, Harden — is precisely the “production says star, tools say prove-it” cohort that beat this same skepticism before. Caleb Wilson (pick 4, 62% star), Christian Anderson Jr. (pick 18, +8.3 edge), and Allen Graves (pick 19, +8.3) follow — the latter two sitting exactly in the model’s proven sweet spot.</w:t>
+        <w:t xml:space="preserve">Cam Boozer (pick 3) is the loudest call in the class: 93% chance (range 81 to 99%) of at least All-Star-level production in his first four seasons, driven by historic offensive production at age 18.9. His statistical family (Zion, Blake Griffin, Harden) is precisely the cohort where production said star, tools said prove it, and production won. Caleb Wilson (pick 4, 62% star), Christian Anderson Jr. (pick 18, +8.3 edge), and Allen Graves (pick 19, +8.3) follow. The latter two sit exactly in the model’s proven sweet spot.</w:t>
       </w:r>
     </w:p>
     <w:p>
@@ -172,7 +172,7 @@
         <w:t xml:space="preserve">The model would have passed. </w:t>
       </w:r>
       <w:r>
-        <w:t xml:space="preserve">Mikel Brown Jr. (pick 6) is the loudest fade: 8% [3–25%] star probability — a lead guard whose assist profile doesn’t match the job description, from the statistical family of Fultz, Dennis Smith Jr., and Sexton. The late-first fades (Stirtz 16, Karaban 29, Thornton 31) share one signature: fine production, posted by 22-year-olds against teenagers. Age-adjustment is the most reliable finding in draft analytics, and the market pays a known-quantity premium against it every June.</w:t>
+        <w:t xml:space="preserve">Mikel Brown Jr. (pick 6) is the loudest fade: an 8% star chance (range 3 to 25%). He is a lead guard whose assist profile does not match the job description, from the statistical family of Fultz, Dennis Smith Jr., and Sexton. The late-first fades (Stirtz 16, Karaban 29, Thornton 31) share one signature: fine production, posted by 22-year-olds against teenagers. Age-adjustment is the most reliable finding in draft analytics, and the market pays a known-quantity premium against it every June.</w:t>
       </w:r>
     </w:p>
     <w:p>
@@ -697,7 +697,7 @@
         <w:spacing w:after="160" w:before="160"/>
       </w:pPr>
       <w:r>
-        <w:t xml:space="preserve">The market’s edge is largest exactly where its private information is deepest (lottery: medicals, workouts, agent intel). It is negative in the early second round — the region where teams spend the least diligence per pick, and where Bane (30), Kyle Anderson (30), and Brunson (33) actually came from. When this model pounds the table between picks 18 and 45, history says listen.</w:t>
+        <w:t xml:space="preserve">The market’s edge is largest exactly where its private information is deepest: the lottery, with its medicals, workouts, and agent intel. It is negative in the early second round, the region where teams spend the least diligence per pick, and where Bane (30), Kyle Anderson (30), and Brunson (33) actually came from. When this model pounds the table between picks 18 and 45, history says listen.</w:t>
       </w:r>
     </w:p>
     <w:p>
@@ -723,7 +723,7 @@
         <w:t xml:space="preserve">tier</w:t>
       </w:r>
       <w:r>
-        <w:t xml:space="preserve"> (what the player became, defined by production bands over the first four seasons — voter accolades excluded), and a market-relative </w:t>
+        <w:t xml:space="preserve"> (what the player became, defined by production bands over the first four seasons, with voter accolades excluded), and a market-relative </w:t>
       </w:r>
       <w:r>
         <w:rPr>
@@ -733,7 +733,7 @@
         <w:t xml:space="preserve">value grade</w:t>
       </w:r>
       <w:r>
-        <w:t xml:space="preserve"> (realized utility minus what the slot promised). Anthony Bennett (Fringe at #1, −11.6) grades Bust. Andrew Wiggins (Starter at #1, −4.6) grades Underdelivered — a disappointment, never a bust; he returned two-thirds of slot value. Jalen Brunson (Rotation at #33, −0.1) Delivered: the rookie-window promise of pick 33 was met almost exactly, and his later All-NBA leap is a retention story, not a drafting one.</w:t>
+        <w:t xml:space="preserve"> (realized utility minus what the slot promised). Anthony Bennett (Fringe at #1, −11.6) grades Bust. Andrew Wiggins (Starter at #1, −4.6) grades Underdelivered, which is a disappointment but never a bust; he returned two-thirds of slot value. Jalen Brunson (Rotation at #33, −0.1) Delivered: the rookie-window promise of pick 33 was met almost exactly, and his later All-NBA leap is a retention story, not a drafting one.</w:t>
       </w:r>
     </w:p>
     <w:p>
@@ -749,7 +749,7 @@
         <w:spacing w:after="160"/>
       </w:pPr>
       <w:r>
-        <w:t xml:space="preserve">Free-text scouting notes are extracted — by a language model, against a fixed 12-trait rubric with per-trait confidence — and Bayesian-update the statistical prior. Two design guarantees: subjective traits (motor, feel) carry the smallest weights, and the total update is capped, so no single note can move the extreme tiers more than ~2.2×. A rave on a weak statistical profile moves it modestly (Stirtz: star probability 3% → 5%); injury context partially rehabilitates a fade (Brown: 8% → 11%). The model supplies base rates; the scout supplies what cameras and box scores can’t see; the math keeps both honest.</w:t>
+        <w:t xml:space="preserve">Free-text scouting notes are read by a language model against a fixed 12-trait rubric with per-trait confidence, and the result updates the statistical prior through Bayes’ rule. Two design guarantees hold: subjective traits (motor, feel) carry the smallest weights, and the total update is capped, so no single note can move the extreme tiers more than ~2.2×. A rave on a weak statistical profile moves it modestly (Stirtz: star probability 3% → 5%); injury context partially rehabilitates a fade (Brown: 8% → 11%). The model supplies base rates; the scout supplies what cameras and box scores can’t see; the math keeps both honest.</w:t>
       </w:r>
     </w:p>
     <w:p>
@@ -786,7 +786,7 @@
         <w:spacing w:after="100"/>
       </w:pPr>
       <w:r>
-        <w:t xml:space="preserve">NCAA D1 only — internationals (~15–20% of first-rounders) shown at market prices, outside model coverage.</w:t>
+        <w:t xml:space="preserve">NCAA Division 1 only. Internationals (roughly 15 to 20% of first-rounders) are shown at market prices, outside model coverage.</w:t>
       </w:r>
     </w:p>
     <w:p>
@@ -799,7 +799,7 @@
         <w:spacing w:after="100"/>
       </w:pPr>
       <w:r>
-        <w:t xml:space="preserve">Box-score ceiling — no tracking, on/off, or medical data; this is most of why the lottery gap exists.</w:t>
+        <w:t xml:space="preserve">Box-score ceiling: no tracking, on/off, or medical data. This is most of why the lottery gap exists.</w:t>
       </w:r>
     </w:p>
     <w:p>
@@ -812,7 +812,7 @@
         <w:spacing w:after="100"/>
       </w:pPr>
       <w:r>
-        <w:t xml:space="preserve">Star tiers rest on 45 training examples — every probability ships with a bootstrap interval.</w:t>
+        <w:t xml:space="preserve">Star tiers rest on 45 training examples, so every probability ships with a bootstrap interval.</w:t>
       </w:r>
     </w:p>
     <w:p>
@@ -838,7 +838,7 @@
         <w:spacing w:after="100"/>
       </w:pPr>
       <w:r>
-        <w:t xml:space="preserve">The 4-season window ends with the rookie contract — late bloomers are annotated, not relabeled.</w:t>
+        <w:t xml:space="preserve">The four-season window ends with the rookie contract. Late bloomers are annotated, not relabeled.</w:t>
       </w:r>
     </w:p>
     <w:p>
@@ -867,7 +867,7 @@
         <w:spacing w:after="160"/>
       </w:pPr>
       <w:r>
-        <w:t xml:space="preserve">Six ordinal tiers over a player’s first four NBA seasons. Quality tiers by production bands: ELITE = best 2-consecutive-played-seasons MP-weighted BPM ≥ +3.5 (min 2,500 MP) or 4-yr VORP ≥ p98 of drafted players; ALL_STAR level = peak-2 BPM ≥ +2.2 (ESPN’s published band). Role tiers by minutes (Starter = 5,000+ MP at 26+ mpg; Rotation = 2,000+ MP; Fringe = 50+ G). Voter accolades are display annotations only.</w:t>
+        <w:t xml:space="preserve">Six ordinal tiers over a player’s first four NBA seasons. Quality tiers use production bands: ELITE means the best two consecutive played seasons reach an MP-weighted BPM of +3.5 or better (minimum 2,500 minutes), or four-year VORP at the 98th percentile of drafted players or above. ALL_STAR level means peak-two BPM of +2.2 or better (ESPN’s published band). Role tiers use minutes: Starter is 5,000+ minutes at 26+ per game, Rotation is 2,000+ minutes, Fringe is 50+ games. Voter accolades are display annotations only.</w:t>
       </w:r>
     </w:p>
     <w:p>
@@ -883,7 +883,7 @@
         <w:spacing w:after="160"/>
       </w:pPr>
       <w:r>
-        <w:t xml:space="preserve">Barttorvik (college player-seasons 2008–2026, 86k rows), Basketball-Reference (drafts, league-wide advanced seasons, accolades, RSCI), nba_api (combine anthro), Rookie Scale (2026 consensus). Entity resolution: 865/867 drafted college players matched (99.8%). Training: classes 2009–2021, drafted D1 players plus combine-invited undrafted (fixes survivorship bias), 847 rows after the eligibility floor (final-season minutes ≥ 40% of team minutes; below it, market prior only, with an insufficient-sample badge).</w:t>
+        <w:t xml:space="preserve">Barttorvik (college player-seasons 2008 to 2026, 86k rows), Basketball-Reference (drafts, league-wide advanced seasons, accolades, RSCI), nba_api (combine anthro), Rookie Scale (2026 consensus). Entity resolution: 865/867 drafted college players matched (99.8%). Training: classes 2009 to 2021, drafted D1 players plus combine-invited undrafted players (fixing survivorship bias), 847 rows after the eligibility floor (final-season minutes ≥ 40% of team minutes; below it, market prior only, with an insufficient-sample badge).</w:t>
       </w:r>
     </w:p>
     <w:p>
@@ -899,7 +899,7 @@
         <w:spacing w:after="160"/>
       </w:pPr>
       <w:r>
-        <w:t xml:space="preserve">56 features: age at draft, anthro (position-conditioned wingspan imputation, informative-missingness indicators), recruiting percentile, per-100 production with empirical-Bayes shrinkage — every rate padded toward its position-group mean with pseudo-attempts sized to that stat’s stabilization speed (heavy for 3P%, light for FT%/stocks) — volumes, trajectory deltas, rim/dunk shares, position interactions. Market information (slots, boards) is excluded by construction: fair value must be computed blind to the price it is judged against.</w:t>
+        <w:t xml:space="preserve">56 features: age at draft, anthropometrics (position-conditioned wingspan imputation, informative-missingness indicators), recruiting percentile, per-100 production with empirical-Bayes shrinkage (every rate padded toward its position-group mean with pseudo-attempts sized to that stat’s stabilization speed, heavy for 3P%, light for FT% and stocks), volumes, trajectory deltas, rim/dunk shares, position interactions. Market information (slots, boards) is excluded by construction: fair value must be computed blind to the price it is judged against.</w:t>
       </w:r>
     </w:p>
     <w:p>
@@ -915,7 +915,7 @@
         <w:spacing w:after="160"/>
       </w:pPr>
       <w:r>
-        <w:t xml:space="preserve">Ordinal logistic (LogisticAT, α=4, 5-tier merged-STAR target) beat LightGBM and 6-tier variants under leave-one-draft-class-out CV. Isotonic calibration on out-of-fold predictions; 100 cluster-bootstrap refits give per-tier intervals. OOF log loss (5-tier space): market prior 1.129, model 1.266 (1.220 calibrated), marginal 1.419 — the “beat the market on average” gate fails, structurally. Blend test: 25% model + 75% market improves the market to 1.124. Edge realized: top-40 favorites +5.33 utility above market (p &lt; 0.0002); top-40 fades −2.07 (p &lt; 0.0002).</w:t>
+        <w:t xml:space="preserve">Ordinal logistic (LogisticAT, α=4, 5-tier merged-STAR target) beat LightGBM and 6-tier variants under leave-one-draft-class-out CV. Isotonic calibration on out-of-fold predictions; 100 cluster-bootstrap refits give per-tier intervals. OOF log loss (5-tier space): market prior 1.129, model 1.266 (1.220 calibrated), marginal 1.419. The gate of beating the market on average fails, and fails structurally. Blend test: 25% model + 75% market improves the market to 1.124. Edge realized: top-40 favorites +5.33 utility above market (p &lt; 0.0002); top-40 fades −2.07 (p &lt; 0.0002).</w:t>
       </w:r>
     </w:p>
     <w:p>
@@ -991,7 +991,7 @@
         <w:spacing w:after="160"/>
       </w:pPr>
       <w:r>
-        <w:t xml:space="preserve">Attribution: exact per-player contributions (coefficient × standardized value), phrased by value sign with push direction shown separately — an unranked recruit reads “Unheralded recruit” with a positive push, because the model learned that profile overdelivers. Comps: k=5 nearest neighbors, position-gated, coefficient-weighted distance, display-only. Notes: 12-trait rubric, per-trait log-tilt strengths 0.08–0.15 (subjective lowest), total cap 0.8; Claude extraction with structured output and keyword fallback; persistent books combine latest-per-trait under the same cap. Availability: draft as a noisy rank race, board value = consensus rank + Student-t(4) noise, σ(rank) = 0.5 + 0.1·rank, calibrated to 2026 slide dispersion; fat tails price real 10–20 pick falls.</w:t>
+        <w:t xml:space="preserve">Attribution: exact per-player contributions (coefficient × standardized value), phrased by value sign with push direction shown separately. An unranked recruit reads “Unheralded recruit” with a positive push, because the model learned that profile overdelivers. Comps: k=5 nearest neighbors, position-gated, coefficient-weighted distance, display-only. Notes: 12-trait rubric, per-trait log-tilt strengths 0.08–0.15 (subjective lowest), total cap 0.8; Claude extraction with structured output and keyword fallback; persistent books combine latest-per-trait under the same cap. Availability: the draft as a noisy rank race, board value equals consensus rank plus Student-t(4) noise, sigma(rank) = 0.5 + 0.1 times rank, calibrated to 2026 slide dispersion. Fat tails price real falls of 10 to 20 picks.</w:t>
       </w:r>
     </w:p>
     <w:p>
@@ -1007,7 +1007,7 @@
         <w:spacing w:after="160"/>
       </w:pPr>
       <w:r>
-        <w:t xml:space="preserve">Every number in this memo regenerates from the public repository — pipeline (scrape → crosswalk → labels → features) and model (prior → train → score → simulate), one command each, all sources free, raw scrapes cached and never redistributed. github.com/YOUR_GITHUB/the-second-round</w:t>
+        <w:t xml:space="preserve">Every number in this memo regenerates from the public repository: pipeline and model, one command each, all sources free, raw scrapes cached and never redistributed. github.com/parikhsahil719/the-second-round</w:t>
       </w:r>
     </w:p>
     <w:sectPr>
@@ -1074,7 +1074,7 @@
         <w:sz w:val="18"/>
         <w:szCs w:val="18"/>
       </w:rPr>
-      <w:t xml:space="preserve">The Second Round — Sahil Parikh — page </w:t>
+      <w:t xml:space="preserve">The Second Round | Sahil Parikh | page </w:t>
     </w:r>
     <w:r>
       <w:rPr>

</xml_diff>